<commit_message>
pushed wrong file T+T
</commit_message>
<xml_diff>
--- a/24BDA70206_ADBMSLabMst/lab mst.docx
+++ b/24BDA70206_ADBMSLabMst/lab mst.docx
@@ -13,27 +13,17 @@
       </w:r>
       <w:proofErr w:type="spellStart"/>
       <w:r>
-        <w:t>d.dept_</w:t>
-      </w:r>
-      <w:proofErr w:type="gramStart"/>
-      <w:r>
-        <w:t>name,e.emp</w:t>
-      </w:r>
-      <w:proofErr w:type="gramEnd"/>
-      <w:r>
-        <w:t>_name</w:t>
+        <w:t>d.dept_name,e.emp_name</w:t>
       </w:r>
       <w:proofErr w:type="spellEnd"/>
       <w:r>
         <w:t xml:space="preserve">, </w:t>
       </w:r>
       <w:proofErr w:type="spellStart"/>
-      <w:proofErr w:type="gramStart"/>
       <w:r>
         <w:t>e.salary</w:t>
       </w:r>
       <w:proofErr w:type="spellEnd"/>
-      <w:proofErr w:type="gramEnd"/>
     </w:p>
     <w:p>
       <w:r>
@@ -50,26 +40,16 @@
         <w:t xml:space="preserve">    ON </w:t>
       </w:r>
       <w:proofErr w:type="spellStart"/>
-      <w:proofErr w:type="gramStart"/>
-      <w:r>
-        <w:t>d.dept</w:t>
-      </w:r>
-      <w:proofErr w:type="gramEnd"/>
-      <w:r>
-        <w:t>_id</w:t>
+      <w:r>
+        <w:t>d.dept_id</w:t>
       </w:r>
       <w:proofErr w:type="spellEnd"/>
       <w:r>
         <w:t xml:space="preserve">= </w:t>
       </w:r>
       <w:proofErr w:type="spellStart"/>
-      <w:proofErr w:type="gramStart"/>
-      <w:r>
-        <w:t>e.dept</w:t>
-      </w:r>
-      <w:proofErr w:type="gramEnd"/>
-      <w:r>
-        <w:t>_id</w:t>
+      <w:r>
+        <w:t>e.dept_id</w:t>
       </w:r>
       <w:proofErr w:type="spellEnd"/>
     </w:p>
@@ -78,27 +58,17 @@
         <w:t xml:space="preserve">WHERE </w:t>
       </w:r>
       <w:proofErr w:type="spellStart"/>
-      <w:proofErr w:type="gramStart"/>
       <w:r>
         <w:t>e.salary</w:t>
       </w:r>
       <w:proofErr w:type="spellEnd"/>
-      <w:proofErr w:type="gramEnd"/>
       <w:r>
         <w:t>&gt; (</w:t>
       </w:r>
     </w:p>
     <w:p>
       <w:r>
-        <w:t xml:space="preserve">    SELECT AVG(e</w:t>
-      </w:r>
-      <w:proofErr w:type="gramStart"/>
-      <w:r>
-        <w:t>2.salary</w:t>
-      </w:r>
-      <w:proofErr w:type="gramEnd"/>
-      <w:r>
-        <w:t>)</w:t>
+        <w:t xml:space="preserve">    SELECT AVG(e2.salary)</w:t>
       </w:r>
     </w:p>
     <w:p>
@@ -108,51 +78,22 @@
     </w:p>
     <w:p>
       <w:r>
-        <w:t xml:space="preserve">    WHERE e</w:t>
-      </w:r>
-      <w:proofErr w:type="gramStart"/>
-      <w:r>
-        <w:t>2.dept</w:t>
-      </w:r>
-      <w:proofErr w:type="gramEnd"/>
-      <w:r>
-        <w:t xml:space="preserve">_id = </w:t>
-      </w:r>
-      <w:proofErr w:type="spellStart"/>
-      <w:proofErr w:type="gramStart"/>
-      <w:r>
-        <w:t>e.dept</w:t>
-      </w:r>
-      <w:proofErr w:type="gramEnd"/>
-      <w:r>
-        <w:t>_id</w:t>
-      </w:r>
-      <w:proofErr w:type="spellEnd"/>
-    </w:p>
-    <w:p>
-      <w:r>
-        <w:t xml:space="preserve">    GROUP BY e</w:t>
-      </w:r>
-      <w:proofErr w:type="gramStart"/>
-      <w:r>
-        <w:t>2.dept</w:t>
-      </w:r>
-      <w:proofErr w:type="gramEnd"/>
-      <w:r>
-        <w:t>_id</w:t>
-      </w:r>
-    </w:p>
-    <w:p>
-      <w:r>
-        <w:t xml:space="preserve">    HAVING </w:t>
-      </w:r>
-      <w:proofErr w:type="gramStart"/>
-      <w:r>
-        <w:t>COUNT(</w:t>
-      </w:r>
-      <w:proofErr w:type="gramEnd"/>
-      <w:r>
-        <w:t>*) &gt;= 3</w:t>
+        <w:t xml:space="preserve">    WHERE e2.dept_id = </w:t>
+      </w:r>
+      <w:proofErr w:type="spellStart"/>
+      <w:r>
+        <w:t>e.dept_id</w:t>
+      </w:r>
+      <w:proofErr w:type="spellEnd"/>
+    </w:p>
+    <w:p>
+      <w:r>
+        <w:t xml:space="preserve">    GROUP BY e2.dept_id</w:t>
+      </w:r>
+    </w:p>
+    <w:p>
+      <w:r>
+        <w:t xml:space="preserve">    HAVING COUNT(*) &gt;= 3</w:t>
       </w:r>
     </w:p>
     <w:p>
@@ -212,40 +153,57 @@
     <w:p/>
     <w:p>
       <w:r>
-        <w:t xml:space="preserve">CREATE OR REPLACE FUNCTION </w:t>
-      </w:r>
-      <w:proofErr w:type="spellStart"/>
-      <w:proofErr w:type="gramStart"/>
-      <w:r>
-        <w:t>csaudit</w:t>
-      </w:r>
-      <w:proofErr w:type="spellEnd"/>
-      <w:r>
-        <w:t>(</w:t>
-      </w:r>
-      <w:proofErr w:type="gramEnd"/>
-      <w:r>
-        <w:t>)</w:t>
-      </w:r>
-    </w:p>
-    <w:p>
-      <w:r>
-        <w:t>RETURNS trigger as $$</w:t>
-      </w:r>
-    </w:p>
-    <w:p>
-      <w:r>
-        <w:t>BEGIN</w:t>
-      </w:r>
-    </w:p>
-    <w:p>
-      <w:r>
-        <w:t xml:space="preserve">    IF (TG_OP= 'INSERT') then</w:t>
-      </w:r>
-    </w:p>
-    <w:p>
-      <w:r>
-        <w:t xml:space="preserve">        INSERT INTO </w:t>
+        <w:t xml:space="preserve">CREATE TABLE </w:t>
+      </w:r>
+      <w:proofErr w:type="spellStart"/>
+      <w:r>
+        <w:t>bank_customer</w:t>
+      </w:r>
+      <w:proofErr w:type="spellEnd"/>
+      <w:r>
+        <w:t xml:space="preserve"> (</w:t>
+      </w:r>
+    </w:p>
+    <w:p>
+      <w:r>
+        <w:t xml:space="preserve">    </w:t>
+      </w:r>
+      <w:proofErr w:type="spellStart"/>
+      <w:r>
+        <w:t>customer_id</w:t>
+      </w:r>
+      <w:proofErr w:type="spellEnd"/>
+      <w:r>
+        <w:t xml:space="preserve"> INT PRIMARY KEY,</w:t>
+      </w:r>
+    </w:p>
+    <w:p>
+      <w:r>
+        <w:t xml:space="preserve">    </w:t>
+      </w:r>
+      <w:proofErr w:type="spellStart"/>
+      <w:r>
+        <w:t>customer_name</w:t>
+      </w:r>
+      <w:proofErr w:type="spellEnd"/>
+      <w:r>
+        <w:t xml:space="preserve"> VARCHAR(50),</w:t>
+      </w:r>
+    </w:p>
+    <w:p>
+      <w:r>
+        <w:t xml:space="preserve">    balance NUMERIC(10,2)</w:t>
+      </w:r>
+    </w:p>
+    <w:p>
+      <w:r>
+        <w:t>);</w:t>
+      </w:r>
+    </w:p>
+    <w:p/>
+    <w:p>
+      <w:r>
+        <w:t xml:space="preserve">CREATE TABLE </w:t>
       </w:r>
       <w:proofErr w:type="spellStart"/>
       <w:r>
@@ -255,13 +213,36 @@
       <w:r>
         <w:t xml:space="preserve"> (</w:t>
       </w:r>
+    </w:p>
+    <w:p>
+      <w:r>
+        <w:t xml:space="preserve">    </w:t>
+      </w:r>
+      <w:proofErr w:type="spellStart"/>
+      <w:r>
+        <w:t>audit_id</w:t>
+      </w:r>
+      <w:proofErr w:type="spellEnd"/>
+      <w:r>
+        <w:t xml:space="preserve"> SERIAL PRIMARY KEY,</w:t>
+      </w:r>
+    </w:p>
+    <w:p>
+      <w:r>
+        <w:t xml:space="preserve">    </w:t>
+      </w:r>
       <w:proofErr w:type="spellStart"/>
       <w:r>
         <w:t>customer_id</w:t>
       </w:r>
       <w:proofErr w:type="spellEnd"/>
       <w:r>
-        <w:t xml:space="preserve">, </w:t>
+        <w:t xml:space="preserve"> INT,</w:t>
+      </w:r>
+    </w:p>
+    <w:p>
+      <w:r>
+        <w:t xml:space="preserve">    </w:t>
       </w:r>
       <w:proofErr w:type="spellStart"/>
       <w:r>
@@ -269,198 +250,371 @@
       </w:r>
       <w:proofErr w:type="spellEnd"/>
       <w:r>
-        <w:t xml:space="preserve">, action, </w:t>
-      </w:r>
-      <w:proofErr w:type="spellStart"/>
-      <w:r>
-        <w:t>action_timestamp</w:t>
-      </w:r>
-      <w:proofErr w:type="spellEnd"/>
-      <w:r>
-        <w:t>)</w:t>
-      </w:r>
-    </w:p>
-    <w:p>
-      <w:r>
-        <w:t xml:space="preserve">        VALUES (</w:t>
-      </w:r>
-      <w:proofErr w:type="spellStart"/>
-      <w:r>
-        <w:t>NEW.customer_id</w:t>
-      </w:r>
-      <w:proofErr w:type="spellEnd"/>
-      <w:r>
-        <w:t xml:space="preserve">, </w:t>
-      </w:r>
-      <w:proofErr w:type="spellStart"/>
-      <w:r>
-        <w:t>NEW.customer_name</w:t>
-      </w:r>
-      <w:proofErr w:type="spellEnd"/>
-      <w:r>
-        <w:t>, 'ADDED', CURRENT_TIMESTAMP);</w:t>
-      </w:r>
-    </w:p>
-    <w:p>
-      <w:r>
-        <w:t xml:space="preserve">        RETURN new;</w:t>
-      </w:r>
-    </w:p>
-    <w:p>
-      <w:r>
-        <w:t xml:space="preserve">    ELSIF (TG_OP ='DELETE') THEN</w:t>
-      </w:r>
-    </w:p>
-    <w:p>
-      <w:r>
-        <w:t xml:space="preserve">        insert INTO </w:t>
-      </w:r>
-      <w:proofErr w:type="spellStart"/>
-      <w:r>
-        <w:t>customer_audit</w:t>
-      </w:r>
-      <w:proofErr w:type="spellEnd"/>
-      <w:r>
-        <w:t xml:space="preserve"> (</w:t>
-      </w:r>
-      <w:proofErr w:type="spellStart"/>
-      <w:r>
-        <w:t>customer_</w:t>
-      </w:r>
-      <w:proofErr w:type="gramStart"/>
-      <w:r>
-        <w:t>id,customer</w:t>
-      </w:r>
-      <w:proofErr w:type="gramEnd"/>
-      <w:r>
-        <w:t>_name</w:t>
-      </w:r>
-      <w:proofErr w:type="spellEnd"/>
-      <w:r>
-        <w:t xml:space="preserve">, action, </w:t>
-      </w:r>
-      <w:proofErr w:type="spellStart"/>
-      <w:r>
-        <w:t>action_timestamp</w:t>
-      </w:r>
-      <w:proofErr w:type="spellEnd"/>
-      <w:r>
-        <w:t>)</w:t>
-      </w:r>
-    </w:p>
-    <w:p>
-      <w:r>
-        <w:t xml:space="preserve">        </w:t>
-      </w:r>
-      <w:proofErr w:type="gramStart"/>
-      <w:r>
-        <w:t>VALUES(</w:t>
-      </w:r>
-      <w:proofErr w:type="spellStart"/>
-      <w:proofErr w:type="gramEnd"/>
-      <w:r>
-        <w:t>OLD.customer_id</w:t>
-      </w:r>
-      <w:proofErr w:type="spellEnd"/>
-      <w:r>
-        <w:t xml:space="preserve">, </w:t>
-      </w:r>
-      <w:proofErr w:type="spellStart"/>
-      <w:r>
-        <w:t>OLD.customer_name</w:t>
-      </w:r>
-      <w:proofErr w:type="spellEnd"/>
-      <w:r>
-        <w:t>, 'REMOVED</w:t>
-      </w:r>
-      <w:proofErr w:type="gramStart"/>
-      <w:r>
-        <w:t>',CURRENT</w:t>
-      </w:r>
-      <w:proofErr w:type="gramEnd"/>
-      <w:r>
-        <w:t>_TIMESTAMP);</w:t>
-      </w:r>
-    </w:p>
-    <w:p>
-      <w:r>
-        <w:t xml:space="preserve">        RETURN OLD;</w:t>
-      </w:r>
-    </w:p>
-    <w:p>
-      <w:r>
-        <w:t xml:space="preserve">    END IF;</w:t>
-      </w:r>
-    </w:p>
-    <w:p>
-      <w:r>
-        <w:t xml:space="preserve">    RETURN NULL;</w:t>
-      </w:r>
-    </w:p>
-    <w:p>
-      <w:r>
-        <w:t>END;</w:t>
-      </w:r>
-    </w:p>
-    <w:p>
-      <w:r>
-        <w:t xml:space="preserve">$$ LANGUAGE </w:t>
-      </w:r>
-      <w:proofErr w:type="spellStart"/>
-      <w:r>
-        <w:t>plpgsql</w:t>
-      </w:r>
-      <w:proofErr w:type="spellEnd"/>
-      <w:r>
-        <w:t>;</w:t>
-      </w:r>
-    </w:p>
-    <w:p/>
-    <w:p>
-      <w:r>
-        <w:t xml:space="preserve">CREATE TRIGGER </w:t>
-      </w:r>
-      <w:proofErr w:type="spellStart"/>
-      <w:r>
-        <w:t>trg</w:t>
-      </w:r>
-      <w:proofErr w:type="spellEnd"/>
-    </w:p>
-    <w:p>
-      <w:r>
-        <w:t xml:space="preserve">AFTER INSERT OR DELETE ON </w:t>
-      </w:r>
-      <w:proofErr w:type="spellStart"/>
-      <w:r>
-        <w:t>bank_customer</w:t>
-      </w:r>
-      <w:proofErr w:type="spellEnd"/>
-    </w:p>
-    <w:p>
-      <w:r>
-        <w:t>FOR EACH ROW</w:t>
-      </w:r>
-    </w:p>
-    <w:p>
-      <w:r>
-        <w:t xml:space="preserve">EXECUTE FUNCTION </w:t>
-      </w:r>
-      <w:proofErr w:type="spellStart"/>
-      <w:proofErr w:type="gramStart"/>
-      <w:r>
-        <w:t>csaudit</w:t>
-      </w:r>
-      <w:proofErr w:type="spellEnd"/>
-      <w:r>
-        <w:t>(</w:t>
-      </w:r>
-      <w:proofErr w:type="gramEnd"/>
+        <w:t xml:space="preserve"> VARCHAR(50),</w:t>
+      </w:r>
+    </w:p>
+    <w:p>
+      <w:r>
+        <w:t xml:space="preserve">    action VARCHAR(20),</w:t>
+      </w:r>
+    </w:p>
+    <w:p>
+      <w:r>
+        <w:t xml:space="preserve">    </w:t>
+      </w:r>
+      <w:proofErr w:type="spellStart"/>
+      <w:r>
+        <w:t>action_time</w:t>
+      </w:r>
+      <w:proofErr w:type="spellEnd"/>
+      <w:r>
+        <w:t xml:space="preserve"> TIMESTAMP</w:t>
+      </w:r>
+    </w:p>
+    <w:p>
       <w:r>
         <w:t>);</w:t>
       </w:r>
     </w:p>
     <w:p/>
     <w:p/>
+    <w:p>
+      <w:r>
+        <w:t xml:space="preserve">CREATE OR REPLACE FUNCTION </w:t>
+      </w:r>
+      <w:proofErr w:type="spellStart"/>
+      <w:r>
+        <w:t>log_customer_changes</w:t>
+      </w:r>
+      <w:proofErr w:type="spellEnd"/>
+      <w:r>
+        <w:t>()</w:t>
+      </w:r>
+    </w:p>
+    <w:p>
+      <w:r>
+        <w:t>RETURNS TRIGGER AS $$</w:t>
+      </w:r>
+    </w:p>
+    <w:p>
+      <w:r>
+        <w:t>BEGIN</w:t>
+      </w:r>
+    </w:p>
+    <w:p>
+      <w:r>
+        <w:t xml:space="preserve">    IF (TG_OP = 'INSERT') THEN</w:t>
+      </w:r>
+    </w:p>
+    <w:p>
+      <w:r>
+        <w:t xml:space="preserve">        INSERT INTO </w:t>
+      </w:r>
+      <w:proofErr w:type="spellStart"/>
+      <w:r>
+        <w:t>customer_audit</w:t>
+      </w:r>
+      <w:proofErr w:type="spellEnd"/>
+      <w:r>
+        <w:t xml:space="preserve"> (</w:t>
+      </w:r>
+      <w:proofErr w:type="spellStart"/>
+      <w:r>
+        <w:t>customer_id</w:t>
+      </w:r>
+      <w:proofErr w:type="spellEnd"/>
+      <w:r>
+        <w:t xml:space="preserve">, </w:t>
+      </w:r>
+      <w:proofErr w:type="spellStart"/>
+      <w:r>
+        <w:t>customer_name</w:t>
+      </w:r>
+      <w:proofErr w:type="spellEnd"/>
+      <w:r>
+        <w:t xml:space="preserve">, action, </w:t>
+      </w:r>
+      <w:proofErr w:type="spellStart"/>
+      <w:r>
+        <w:t>action_time</w:t>
+      </w:r>
+      <w:proofErr w:type="spellEnd"/>
+      <w:r>
+        <w:t>)</w:t>
+      </w:r>
+    </w:p>
+    <w:p>
+      <w:r>
+        <w:t xml:space="preserve">        VALUES (</w:t>
+      </w:r>
+      <w:proofErr w:type="spellStart"/>
+      <w:r>
+        <w:t>NEW.customer_id</w:t>
+      </w:r>
+      <w:proofErr w:type="spellEnd"/>
+      <w:r>
+        <w:t xml:space="preserve">, </w:t>
+      </w:r>
+      <w:proofErr w:type="spellStart"/>
+      <w:r>
+        <w:t>NEW.customer_name</w:t>
+      </w:r>
+      <w:proofErr w:type="spellEnd"/>
+      <w:r>
+        <w:t>, 'ADDED', CURRENT_TIMESTAMP);</w:t>
+      </w:r>
+    </w:p>
+    <w:p>
+      <w:r>
+        <w:t xml:space="preserve">        RETURN NEW;</w:t>
+      </w:r>
+    </w:p>
+    <w:p>
+      <w:r>
+        <w:t xml:space="preserve">        </w:t>
+      </w:r>
+    </w:p>
+    <w:p>
+      <w:r>
+        <w:t xml:space="preserve">    ELSIF (TG_OP = 'DELETE') THEN</w:t>
+      </w:r>
+    </w:p>
+    <w:p>
+      <w:r>
+        <w:t xml:space="preserve">        INSERT INTO </w:t>
+      </w:r>
+      <w:proofErr w:type="spellStart"/>
+      <w:r>
+        <w:t>customer_audit</w:t>
+      </w:r>
+      <w:proofErr w:type="spellEnd"/>
+      <w:r>
+        <w:t xml:space="preserve"> (</w:t>
+      </w:r>
+      <w:proofErr w:type="spellStart"/>
+      <w:r>
+        <w:t>customer_id</w:t>
+      </w:r>
+      <w:proofErr w:type="spellEnd"/>
+      <w:r>
+        <w:t xml:space="preserve">, </w:t>
+      </w:r>
+      <w:proofErr w:type="spellStart"/>
+      <w:r>
+        <w:t>customer_name</w:t>
+      </w:r>
+      <w:proofErr w:type="spellEnd"/>
+      <w:r>
+        <w:t xml:space="preserve">, action, </w:t>
+      </w:r>
+      <w:proofErr w:type="spellStart"/>
+      <w:r>
+        <w:t>action_time</w:t>
+      </w:r>
+      <w:proofErr w:type="spellEnd"/>
+      <w:r>
+        <w:t>)</w:t>
+      </w:r>
+    </w:p>
+    <w:p>
+      <w:r>
+        <w:t xml:space="preserve">        VALUES (</w:t>
+      </w:r>
+      <w:proofErr w:type="spellStart"/>
+      <w:r>
+        <w:t>OLD.customer_id</w:t>
+      </w:r>
+      <w:proofErr w:type="spellEnd"/>
+      <w:r>
+        <w:t xml:space="preserve">, </w:t>
+      </w:r>
+      <w:proofErr w:type="spellStart"/>
+      <w:r>
+        <w:t>OLD.customer_name</w:t>
+      </w:r>
+      <w:proofErr w:type="spellEnd"/>
+      <w:r>
+        <w:t>, 'REMOVED', CURRENT_TIMESTAMP);</w:t>
+      </w:r>
+    </w:p>
+    <w:p>
+      <w:r>
+        <w:lastRenderedPageBreak/>
+        <w:t xml:space="preserve">        RETURN OLD;</w:t>
+      </w:r>
+    </w:p>
+    <w:p>
+      <w:r>
+        <w:t xml:space="preserve">    END IF;</w:t>
+      </w:r>
+    </w:p>
+    <w:p>
+      <w:r>
+        <w:t xml:space="preserve">    </w:t>
+      </w:r>
+    </w:p>
+    <w:p>
+      <w:r>
+        <w:t xml:space="preserve">    RETURN NULL;</w:t>
+      </w:r>
+    </w:p>
+    <w:p>
+      <w:r>
+        <w:t>END;</w:t>
+      </w:r>
+    </w:p>
+    <w:p>
+      <w:r>
+        <w:t xml:space="preserve">$$ LANGUAGE </w:t>
+      </w:r>
+      <w:proofErr w:type="spellStart"/>
+      <w:r>
+        <w:t>plpgsql</w:t>
+      </w:r>
+      <w:proofErr w:type="spellEnd"/>
+      <w:r>
+        <w:t>;</w:t>
+      </w:r>
+    </w:p>
+    <w:p/>
+    <w:p>
+      <w:r>
+        <w:t xml:space="preserve">CREATE TRIGGER </w:t>
+      </w:r>
+      <w:proofErr w:type="spellStart"/>
+      <w:r>
+        <w:t>trg_customer_audit</w:t>
+      </w:r>
+      <w:proofErr w:type="spellEnd"/>
+    </w:p>
+    <w:p>
+      <w:r>
+        <w:t xml:space="preserve">AFTER INSERT OR DELETE ON </w:t>
+      </w:r>
+      <w:proofErr w:type="spellStart"/>
+      <w:r>
+        <w:t>bank_customer</w:t>
+      </w:r>
+      <w:proofErr w:type="spellEnd"/>
+    </w:p>
+    <w:p>
+      <w:r>
+        <w:t>FOR EACH ROW</w:t>
+      </w:r>
+    </w:p>
+    <w:p>
+      <w:r>
+        <w:t xml:space="preserve">EXECUTE FUNCTION </w:t>
+      </w:r>
+      <w:proofErr w:type="spellStart"/>
+      <w:r>
+        <w:t>log_customer_changes</w:t>
+      </w:r>
+      <w:proofErr w:type="spellEnd"/>
+      <w:r>
+        <w:t>();</w:t>
+      </w:r>
+    </w:p>
+    <w:p/>
+    <w:p>
+      <w:r>
+        <w:t xml:space="preserve">INSERT INTO </w:t>
+      </w:r>
+      <w:proofErr w:type="spellStart"/>
+      <w:r>
+        <w:t>bank_customer</w:t>
+      </w:r>
+      <w:proofErr w:type="spellEnd"/>
+      <w:r>
+        <w:t xml:space="preserve"> VALUES (1, 'jay', 60000), (2, 'papa', 849282);</w:t>
+      </w:r>
+    </w:p>
+    <w:p>
+      <w:r>
+        <w:t xml:space="preserve">INSERT INTO </w:t>
+      </w:r>
+      <w:proofErr w:type="spellStart"/>
+      <w:r>
+        <w:t>bank_customer</w:t>
+      </w:r>
+      <w:proofErr w:type="spellEnd"/>
+      <w:r>
+        <w:t xml:space="preserve"> VALUES (3, 'mummy', 80000);</w:t>
+      </w:r>
+    </w:p>
+    <w:p>
+      <w:r>
+        <w:t xml:space="preserve">DELETE FROM </w:t>
+      </w:r>
+      <w:proofErr w:type="spellStart"/>
+      <w:r>
+        <w:t>bank_customer</w:t>
+      </w:r>
+      <w:proofErr w:type="spellEnd"/>
+      <w:r>
+        <w:t xml:space="preserve"> WHERE </w:t>
+      </w:r>
+      <w:proofErr w:type="spellStart"/>
+      <w:r>
+        <w:t>customer_id</w:t>
+      </w:r>
+      <w:proofErr w:type="spellEnd"/>
+      <w:r>
+        <w:t xml:space="preserve"> = 1;</w:t>
+      </w:r>
+    </w:p>
+    <w:p>
+      <w:r>
+        <w:t xml:space="preserve">SELECT * FROM </w:t>
+      </w:r>
+      <w:proofErr w:type="spellStart"/>
+      <w:r>
+        <w:t>customer_audit</w:t>
+      </w:r>
+      <w:proofErr w:type="spellEnd"/>
+      <w:r>
+        <w:t>;</w:t>
+      </w:r>
+    </w:p>
+    <w:p>
+      <w:r>
+        <w:drawing>
+          <wp:inline distT="0" distB="0" distL="0" distR="0" wp14:anchorId="2A186FC8" wp14:editId="7B92353C">
+            <wp:extent cx="5731510" cy="3025140"/>
+            <wp:effectExtent l="0" t="0" r="2540" b="3810"/>
+            <wp:docPr id="1003843869" name="Picture 1"/>
+            <wp:cNvGraphicFramePr>
+              <a:graphicFrameLocks xmlns:a="http://schemas.openxmlformats.org/drawingml/2006/main" noChangeAspect="1"/>
+            </wp:cNvGraphicFramePr>
+            <a:graphic xmlns:a="http://schemas.openxmlformats.org/drawingml/2006/main">
+              <a:graphicData uri="http://schemas.openxmlformats.org/drawingml/2006/picture">
+                <pic:pic xmlns:pic="http://schemas.openxmlformats.org/drawingml/2006/picture">
+                  <pic:nvPicPr>
+                    <pic:cNvPr id="1003843869" name=""/>
+                    <pic:cNvPicPr/>
+                  </pic:nvPicPr>
+                  <pic:blipFill>
+                    <a:blip r:embed="rId5"/>
+                    <a:stretch>
+                      <a:fillRect/>
+                    </a:stretch>
+                  </pic:blipFill>
+                  <pic:spPr>
+                    <a:xfrm>
+                      <a:off x="0" y="0"/>
+                      <a:ext cx="5731510" cy="3025140"/>
+                    </a:xfrm>
+                    <a:prstGeom prst="rect">
+                      <a:avLst/>
+                    </a:prstGeom>
+                  </pic:spPr>
+                </pic:pic>
+              </a:graphicData>
+            </a:graphic>
+          </wp:inline>
+        </w:drawing>
+      </w:r>
+    </w:p>
     <w:sectPr>
       <w:pgSz w:w="11906" w:h="16838"/>
       <w:pgMar w:top="1440" w:right="1440" w:bottom="1440" w:left="1440" w:header="708" w:footer="708" w:gutter="0"/>

</xml_diff>